<commit_message>
Add BRD screenshots, live-prototype link, header table, and reminder-delivery-source note
Co-Authored-By: Claude Sonnet 5 <noreply@anthropic.com>
</commit_message>
<xml_diff>
--- a/Compliance Tracker - BRD.docx
+++ b/Compliance Tracker - BRD.docx
@@ -36,7 +36,7 @@
         </w:p>
       </w:sdtContent>
     </w:sdt>
-    <w:bookmarkStart w:id="131" w:name="X28236e03c6bb9f351c04a21832df4269bb67e51"/>
+    <w:bookmarkStart w:id="132" w:name="X28236e03c6bb9f351c04a21832df4269bb67e51"/>
     <w:p>
       <w:pPr>
         <w:pStyle w:val="Heading1"/>
@@ -68,6 +68,62 @@
                 <w:b/>
                 <w:bCs/>
               </w:rPr>
+              <w:t xml:space="preserve">Product</w:t>
+            </w:r>
+          </w:p>
+        </w:tc>
+        <w:tc>
+          <w:tcPr/>
+          <w:p>
+            <w:pPr>
+              <w:pStyle w:val="Compact"/>
+            </w:pPr>
+            <w:r>
+              <w:t xml:space="preserve">Compliance Tracker</w:t>
+            </w:r>
+          </w:p>
+        </w:tc>
+      </w:tr>
+      <w:tr>
+        <w:tc>
+          <w:tcPr/>
+          <w:p>
+            <w:pPr>
+              <w:pStyle w:val="Compact"/>
+            </w:pPr>
+            <w:r>
+              <w:rPr>
+                <w:b/>
+                <w:bCs/>
+              </w:rPr>
+              <w:t xml:space="preserve">Objective</w:t>
+            </w:r>
+          </w:p>
+        </w:tc>
+        <w:tc>
+          <w:tcPr/>
+          <w:p>
+            <w:pPr>
+              <w:pStyle w:val="Compact"/>
+            </w:pPr>
+            <w:r>
+              <w:t xml:space="preserve">Automatic compliance mapping, status updates, and client reminders, all in one place.</w:t>
+            </w:r>
+          </w:p>
+        </w:tc>
+      </w:tr>
+      <w:tr>
+        <w:tc>
+          <w:tcPr/>
+          <w:p>
+            <w:pPr>
+              <w:pStyle w:val="Compact"/>
+            </w:pPr>
+            <w:r>
+              <w:rPr>
+                <w:b/>
+                <w:bCs/>
+              </w:rPr>
               <w:t xml:space="preserve">Version</w:t>
             </w:r>
           </w:p>
@@ -79,7 +135,7 @@
               <w:pStyle w:val="Compact"/>
             </w:pPr>
             <w:r>
-              <w:t xml:space="preserve">0.2 (Draft)</w:t>
+              <w:t xml:space="preserve">0.2</w:t>
             </w:r>
           </w:p>
         </w:tc>
@@ -107,7 +163,7 @@
               <w:pStyle w:val="Compact"/>
             </w:pPr>
             <w:r>
-              <w:t xml:space="preserve">25 August 2026</w:t>
+              <w:t xml:space="preserve">26 August 2026</w:t>
             </w:r>
           </w:p>
         </w:tc>
@@ -163,13 +219,70 @@
               <w:pStyle w:val="Compact"/>
             </w:pPr>
             <w:r>
-              <w:t xml:space="preserve">Draft. All 11 modules drafted, for review. Supersedes version 0.1.</w:t>
+              <w:t xml:space="preserve">Ready for review</w:t>
+            </w:r>
+          </w:p>
+        </w:tc>
+      </w:tr>
+      <w:tr>
+        <w:tc>
+          <w:tcPr/>
+          <w:p>
+            <w:pPr>
+              <w:pStyle w:val="Compact"/>
+            </w:pPr>
+            <w:r>
+              <w:rPr>
+                <w:b/>
+                <w:bCs/>
+              </w:rPr>
+              <w:t xml:space="preserve">Live prototype</w:t>
+            </w:r>
+          </w:p>
+        </w:tc>
+        <w:tc>
+          <w:tcPr/>
+          <w:p>
+            <w:pPr>
+              <w:pStyle w:val="Compact"/>
+            </w:pPr>
+            <w:hyperlink r:id="rId9">
+              <w:r>
+                <w:rPr>
+                  <w:rStyle w:val="Hyperlink"/>
+                </w:rPr>
+                <w:t xml:space="preserve">https://kartikkhandelwal-pm.github.io/Compliance-Tracker/</w:t>
+              </w:r>
+            </w:hyperlink>
+            <w:r>
+              <w:t xml:space="preserve"> </w:t>
+            </w:r>
+            <w:r>
+              <w:t xml:space="preserve">(for reference; see note below)</w:t>
             </w:r>
           </w:p>
         </w:tc>
       </w:tr>
     </w:tbl>
-    <w:bookmarkStart w:id="9" w:name="objective"/>
+    <w:p>
+      <w:pPr>
+        <w:pStyle w:val="BodyText"/>
+      </w:pPr>
+      <w:r>
+        <w:rPr>
+          <w:b/>
+          <w:bCs/>
+        </w:rPr>
+        <w:t xml:space="preserve">Note:</w:t>
+      </w:r>
+      <w:r>
+        <w:t xml:space="preserve"> </w:t>
+      </w:r>
+      <w:r>
+        <w:t xml:space="preserve">Screenshots and the live prototype above are for reference only.</w:t>
+      </w:r>
+    </w:p>
+    <w:bookmarkStart w:id="10" w:name="objective"/>
     <w:p>
       <w:pPr>
         <w:pStyle w:val="Heading2"/>
@@ -204,8 +317,8 @@
         <w:t xml:space="preserve">across spreadsheets and manual follow-ups.</w:t>
       </w:r>
     </w:p>
-    <w:bookmarkEnd w:id="9"/>
-    <w:bookmarkStart w:id="10" w:name="scope"/>
+    <w:bookmarkEnd w:id="10"/>
+    <w:bookmarkStart w:id="11" w:name="scope"/>
     <w:p>
       <w:pPr>
         <w:pStyle w:val="Heading2"/>
@@ -340,8 +453,8 @@
         <w:t xml:space="preserve">Dashboard: a single-glance overview of the firm’s overall compliance position</w:t>
       </w:r>
     </w:p>
-    <w:bookmarkEnd w:id="10"/>
-    <w:bookmarkStart w:id="11" w:name="about-this-document"/>
+    <w:bookmarkEnd w:id="11"/>
+    <w:bookmarkStart w:id="12" w:name="about-this-document"/>
     <w:p>
       <w:pPr>
         <w:pStyle w:val="Heading2"/>
@@ -394,8 +507,8 @@
         <w:t xml:space="preserve">is received, this document and the underlying product will be revised accordingly.</w:t>
       </w:r>
     </w:p>
-    <w:bookmarkEnd w:id="11"/>
-    <w:bookmarkStart w:id="12" w:name="modules-in-this-document"/>
+    <w:bookmarkEnd w:id="12"/>
+    <w:bookmarkStart w:id="13" w:name="modules-in-this-document"/>
     <w:p>
       <w:pPr>
         <w:pStyle w:val="Heading2"/>
@@ -551,8 +664,8 @@
         </w:pict>
       </w:r>
     </w:p>
-    <w:bookmarkEnd w:id="12"/>
-    <w:bookmarkStart w:id="13" w:name="rule-engine-reference"/>
+    <w:bookmarkEnd w:id="13"/>
+    <w:bookmarkStart w:id="14" w:name="rule-engine-reference"/>
     <w:p>
       <w:pPr>
         <w:pStyle w:val="Heading2"/>
@@ -604,8 +717,8 @@
         </w:pict>
       </w:r>
     </w:p>
-    <w:bookmarkEnd w:id="13"/>
-    <w:bookmarkStart w:id="25" w:name="module-1-dashboard"/>
+    <w:bookmarkEnd w:id="14"/>
+    <w:bookmarkStart w:id="26" w:name="module-1-dashboard"/>
     <w:p>
       <w:pPr>
         <w:pStyle w:val="Heading2"/>
@@ -614,7 +727,7 @@
         <w:t xml:space="preserve">Module 1: Dashboard</w:t>
       </w:r>
     </w:p>
-    <w:bookmarkStart w:id="14" w:name="purpose"/>
+    <w:bookmarkStart w:id="15" w:name="purpose"/>
     <w:p>
       <w:pPr>
         <w:pStyle w:val="Heading3"/>
@@ -658,8 +771,8 @@
         <w:t xml:space="preserve">, across the whole firm or just the signed-in staff member’s own clients.</w:t>
       </w:r>
     </w:p>
-    <w:bookmarkEnd w:id="14"/>
-    <w:bookmarkStart w:id="15" w:name="layout-top-to-bottom"/>
+    <w:bookmarkEnd w:id="15"/>
+    <w:bookmarkStart w:id="16" w:name="layout-top-to-bottom"/>
     <w:p>
       <w:pPr>
         <w:pStyle w:val="Heading3"/>
@@ -728,8 +841,8 @@
         <w:t xml:space="preserve">Work queue card (3 tabs: In arrears / This week / Next 45 days)</w:t>
       </w:r>
     </w:p>
-    <w:bookmarkEnd w:id="15"/>
-    <w:bookmarkStart w:id="16" w:name="page-header"/>
+    <w:bookmarkEnd w:id="16"/>
+    <w:bookmarkStart w:id="17" w:name="page-header"/>
     <w:p>
       <w:pPr>
         <w:pStyle w:val="Heading3"/>
@@ -910,8 +1023,8 @@
         <w:t xml:space="preserve">every time the page is reloaded.</w:t>
       </w:r>
     </w:p>
-    <w:bookmarkEnd w:id="16"/>
-    <w:bookmarkStart w:id="17" w:name="hero-card-due-in-the-next-7-days"/>
+    <w:bookmarkEnd w:id="17"/>
+    <w:bookmarkStart w:id="18" w:name="hero-card-due-in-the-next-7-days"/>
     <w:p>
       <w:pPr>
         <w:pStyle w:val="Heading3"/>
@@ -1248,8 +1361,8 @@
         <w:t xml:space="preserve">.</w:t>
       </w:r>
     </w:p>
-    <w:bookmarkEnd w:id="17"/>
-    <w:bookmarkStart w:id="18" w:name="kpi-tiles-22-grid-right-of-the-hero"/>
+    <w:bookmarkEnd w:id="18"/>
+    <w:bookmarkStart w:id="19" w:name="kpi-tiles-22-grid-right-of-the-hero"/>
     <w:p>
       <w:pPr>
         <w:pStyle w:val="Heading3"/>
@@ -1884,8 +1997,8 @@
         <w:t xml:space="preserve">, already filtered to clients with no owner.</w:t>
       </w:r>
     </w:p>
-    <w:bookmarkEnd w:id="18"/>
-    <w:bookmarkStart w:id="19" w:name="Xa987d7780a5ba5a0819eed2e49a32c04e69d342"/>
+    <w:bookmarkEnd w:id="19"/>
+    <w:bookmarkStart w:id="20" w:name="Xa987d7780a5ba5a0819eed2e49a32c04e69d342"/>
     <w:p>
       <w:pPr>
         <w:pStyle w:val="Heading3"/>
@@ -2121,8 +2234,8 @@
         <w:t xml:space="preserve">This chart is not clickable. It’s for information only.</w:t>
       </w:r>
     </w:p>
-    <w:bookmarkEnd w:id="19"/>
-    <w:bookmarkStart w:id="20" w:name="chart-card-2-late-fees-by-head-estimated"/>
+    <w:bookmarkEnd w:id="20"/>
+    <w:bookmarkStart w:id="21" w:name="chart-card-2-late-fees-by-head-estimated"/>
     <w:p>
       <w:pPr>
         <w:pStyle w:val="Heading3"/>
@@ -2302,8 +2415,8 @@
         <w:t xml:space="preserve">percentage of turnover. Each bar reflects that compliance’s own penalty rule.</w:t>
       </w:r>
     </w:p>
-    <w:bookmarkEnd w:id="20"/>
-    <w:bookmarkStart w:id="21" w:name="X0974fdcfee0a2da7b5ac553c1da65e7fb8dbead"/>
+    <w:bookmarkEnd w:id="21"/>
+    <w:bookmarkStart w:id="22" w:name="X0974fdcfee0a2da7b5ac553c1da65e7fb8dbead"/>
     <w:p>
       <w:pPr>
         <w:pStyle w:val="Heading3"/>
@@ -2827,8 +2940,8 @@
         <w:t xml:space="preserve">once done.</w:t>
       </w:r>
     </w:p>
-    <w:bookmarkEnd w:id="21"/>
-    <w:bookmarkStart w:id="22" w:name="X2bdc4f0e465d1f86ee3ac70251599d6beb1d580"/>
+    <w:bookmarkEnd w:id="22"/>
+    <w:bookmarkStart w:id="23" w:name="X2bdc4f0e465d1f86ee3ac70251599d6beb1d580"/>
     <w:p>
       <w:pPr>
         <w:pStyle w:val="Heading3"/>
@@ -3696,8 +3809,8 @@
         <w:t xml:space="preserve">back.</w:t>
       </w:r>
     </w:p>
-    <w:bookmarkEnd w:id="22"/>
-    <w:bookmarkStart w:id="23" w:name="filing-runway-30-day-strip"/>
+    <w:bookmarkEnd w:id="23"/>
+    <w:bookmarkStart w:id="24" w:name="filing-runway-30-day-strip"/>
     <w:p>
       <w:pPr>
         <w:pStyle w:val="Heading3"/>
@@ -4063,8 +4176,8 @@
         <w:t xml:space="preserve">together. On a larger screen they simply fit the full width; no scrolling needed.</w:t>
       </w:r>
     </w:p>
-    <w:bookmarkEnd w:id="23"/>
-    <w:bookmarkStart w:id="24" w:name="work-queue-card-3-tabs"/>
+    <w:bookmarkEnd w:id="24"/>
+    <w:bookmarkStart w:id="25" w:name="work-queue-card-3-tabs"/>
     <w:p>
       <w:pPr>
         <w:pStyle w:val="Heading3"/>
@@ -4593,9 +4706,9 @@
         </w:pict>
       </w:r>
     </w:p>
-    <w:bookmarkEnd w:id="24"/>
     <w:bookmarkEnd w:id="25"/>
-    <w:bookmarkStart w:id="38" w:name="module-2-calendar"/>
+    <w:bookmarkEnd w:id="26"/>
+    <w:bookmarkStart w:id="39" w:name="module-2-calendar"/>
     <w:p>
       <w:pPr>
         <w:pStyle w:val="Heading2"/>
@@ -4604,7 +4717,7 @@
         <w:t xml:space="preserve">Module 2: Calendar</w:t>
       </w:r>
     </w:p>
-    <w:bookmarkStart w:id="26" w:name="purpose-1"/>
+    <w:bookmarkStart w:id="27" w:name="purpose-1"/>
     <w:p>
       <w:pPr>
         <w:pStyle w:val="Heading3"/>
@@ -4627,8 +4740,8 @@
         <w:t xml:space="preserve">ordered list for the whole financial year. This is the screen a firm plans its week from.</w:t>
       </w:r>
     </w:p>
-    <w:bookmarkEnd w:id="26"/>
-    <w:bookmarkStart w:id="27" w:name="layout-top-to-bottom-1"/>
+    <w:bookmarkEnd w:id="27"/>
+    <w:bookmarkStart w:id="28" w:name="layout-top-to-bottom-1"/>
     <w:p>
       <w:pPr>
         <w:pStyle w:val="Heading3"/>
@@ -4739,8 +4852,8 @@
         <w:t xml:space="preserve">A small note about where the dates come from</w:t>
       </w:r>
     </w:p>
-    <w:bookmarkEnd w:id="27"/>
-    <w:bookmarkStart w:id="28" w:name="page-header-1"/>
+    <w:bookmarkEnd w:id="28"/>
+    <w:bookmarkStart w:id="29" w:name="page-header-1"/>
     <w:p>
       <w:pPr>
         <w:pStyle w:val="Heading3"/>
@@ -5010,8 +5123,8 @@
         <w:t xml:space="preserve">month, and clears any picked day, no matter where the user currently is.</w:t>
       </w:r>
     </w:p>
-    <w:bookmarkEnd w:id="28"/>
-    <w:bookmarkStart w:id="29" w:name="filters-row"/>
+    <w:bookmarkEnd w:id="29"/>
+    <w:bookmarkStart w:id="30" w:name="filters-row"/>
     <w:p>
       <w:pPr>
         <w:pStyle w:val="Heading3"/>
@@ -5260,8 +5373,8 @@
         <w:t xml:space="preserve">, reflecting whichever filters are currently active.</w:t>
       </w:r>
     </w:p>
-    <w:bookmarkEnd w:id="29"/>
-    <w:bookmarkStart w:id="30" w:name="month-strip"/>
+    <w:bookmarkEnd w:id="30"/>
+    <w:bookmarkStart w:id="31" w:name="month-strip"/>
     <w:p>
       <w:pPr>
         <w:pStyle w:val="Heading3"/>
@@ -5394,8 +5507,8 @@
         <w:t xml:space="preserve">out at a glance along the strip.</w:t>
       </w:r>
     </w:p>
-    <w:bookmarkEnd w:id="30"/>
-    <w:bookmarkStart w:id="31" w:name="month-at-a-glance-4-boxes"/>
+    <w:bookmarkEnd w:id="31"/>
+    <w:bookmarkStart w:id="32" w:name="month-at-a-glance-4-boxes"/>
     <w:p>
       <w:pPr>
         <w:pStyle w:val="Heading3"/>
@@ -5758,8 +5871,8 @@
         <w:t xml:space="preserve">if the month has nothing due at all.</w:t>
       </w:r>
     </w:p>
-    <w:bookmarkEnd w:id="31"/>
-    <w:bookmarkStart w:id="32" w:name="calendar-grid-view"/>
+    <w:bookmarkEnd w:id="32"/>
+    <w:bookmarkStart w:id="33" w:name="calendar-grid-view"/>
     <w:p>
       <w:pPr>
         <w:pStyle w:val="Heading3"/>
@@ -6227,8 +6340,8 @@
         <w:t xml:space="preserve">.</w:t>
       </w:r>
     </w:p>
-    <w:bookmarkEnd w:id="32"/>
-    <w:bookmarkStart w:id="33" w:name="timeline-view"/>
+    <w:bookmarkEnd w:id="33"/>
+    <w:bookmarkStart w:id="34" w:name="timeline-view"/>
     <w:p>
       <w:pPr>
         <w:pStyle w:val="Heading3"/>
@@ -6461,8 +6574,8 @@
         <w:t xml:space="preserve">statutory dates match the current filters.”</w:t>
       </w:r>
     </w:p>
-    <w:bookmarkEnd w:id="33"/>
-    <w:bookmarkStart w:id="34" w:name="X1b14780dce87bec21725cffff8f15a724539f36"/>
+    <w:bookmarkEnd w:id="34"/>
+    <w:bookmarkStart w:id="35" w:name="X1b14780dce87bec21725cffff8f15a724539f36"/>
     <w:p>
       <w:pPr>
         <w:pStyle w:val="Heading3"/>
@@ -6585,8 +6698,8 @@
         <w:t xml:space="preserve">, describing where the underlying click goes.</w:t>
       </w:r>
     </w:p>
-    <w:bookmarkEnd w:id="34"/>
-    <w:bookmarkStart w:id="35" w:name="day-panel-or-month-list"/>
+    <w:bookmarkEnd w:id="35"/>
+    <w:bookmarkStart w:id="36" w:name="day-panel-or-month-list"/>
     <w:p>
       <w:pPr>
         <w:pStyle w:val="Heading3"/>
@@ -6733,8 +6846,8 @@
         <w:t xml:space="preserve">kind of sortable filing list, covering the whole month instead of one day.</w:t>
       </w:r>
     </w:p>
-    <w:bookmarkEnd w:id="35"/>
-    <w:bookmarkStart w:id="36" w:name="footer-note"/>
+    <w:bookmarkEnd w:id="36"/>
+    <w:bookmarkStart w:id="37" w:name="footer-note"/>
     <w:p>
       <w:pPr>
         <w:pStyle w:val="Heading3"/>
@@ -6799,8 +6912,8 @@
         <w:t xml:space="preserve">rule is added to the underlying calendar logic.</w:t>
       </w:r>
     </w:p>
-    <w:bookmarkEnd w:id="36"/>
-    <w:bookmarkStart w:id="37" w:name="X2c90667fd0f0b6f1b2e069e8ceed672c8f765ca"/>
+    <w:bookmarkEnd w:id="37"/>
+    <w:bookmarkStart w:id="38" w:name="X2c90667fd0f0b6f1b2e069e8ceed672c8f765ca"/>
     <w:p>
       <w:pPr>
         <w:pStyle w:val="Heading3"/>
@@ -7052,9 +7165,9 @@
         </w:pict>
       </w:r>
     </w:p>
-    <w:bookmarkEnd w:id="37"/>
     <w:bookmarkEnd w:id="38"/>
-    <w:bookmarkStart w:id="49" w:name="module-3-compliances"/>
+    <w:bookmarkEnd w:id="39"/>
+    <w:bookmarkStart w:id="50" w:name="module-3-compliances"/>
     <w:p>
       <w:pPr>
         <w:pStyle w:val="Heading2"/>
@@ -7077,7 +7190,7 @@
         <w:t xml:space="preserve">reached by opening one compliance from it.</w:t>
       </w:r>
     </w:p>
-    <w:bookmarkStart w:id="39" w:name="purpose-2"/>
+    <w:bookmarkStart w:id="40" w:name="purpose-2"/>
     <w:p>
       <w:pPr>
         <w:pStyle w:val="Heading3"/>
@@ -7151,8 +7264,8 @@
         <w:t xml:space="preserve">own module later in this document, which lists every client due that date.</w:t>
       </w:r>
     </w:p>
-    <w:bookmarkEnd w:id="39"/>
-    <w:bookmarkStart w:id="40" w:name="layout-top-to-bottom-list-screen"/>
+    <w:bookmarkEnd w:id="40"/>
+    <w:bookmarkStart w:id="41" w:name="layout-top-to-bottom-list-screen"/>
     <w:p>
       <w:pPr>
         <w:pStyle w:val="Heading3"/>
@@ -7197,8 +7310,8 @@
         <w:t xml:space="preserve">Compliance cards, grouped into sections</w:t>
       </w:r>
     </w:p>
-    <w:bookmarkEnd w:id="40"/>
-    <w:bookmarkStart w:id="41" w:name="page-header-2"/>
+    <w:bookmarkEnd w:id="41"/>
+    <w:bookmarkStart w:id="42" w:name="page-header-2"/>
     <w:p>
       <w:pPr>
         <w:pStyle w:val="Heading3"/>
@@ -7348,8 +7461,8 @@
         <w:t xml:space="preserve">shows one specific year’s state.</w:t>
       </w:r>
     </w:p>
-    <w:bookmarkEnd w:id="41"/>
-    <w:bookmarkStart w:id="42" w:name="filters-row-1"/>
+    <w:bookmarkEnd w:id="42"/>
+    <w:bookmarkStart w:id="43" w:name="filters-row-1"/>
     <w:p>
       <w:pPr>
         <w:pStyle w:val="Heading3"/>
@@ -7566,8 +7679,8 @@
         <w:t xml:space="preserve">that: try a different form code or clear the head filter.”</w:t>
       </w:r>
     </w:p>
-    <w:bookmarkEnd w:id="42"/>
-    <w:bookmarkStart w:id="43" w:name="grouping-and-sections"/>
+    <w:bookmarkEnd w:id="43"/>
+    <w:bookmarkStart w:id="44" w:name="grouping-and-sections"/>
     <w:p>
       <w:pPr>
         <w:pStyle w:val="Heading3"/>
@@ -7678,8 +7791,8 @@
         <w:t xml:space="preserve">section headings at all.</w:t>
       </w:r>
     </w:p>
-    <w:bookmarkEnd w:id="43"/>
-    <w:bookmarkStart w:id="44" w:name="compliance-cards"/>
+    <w:bookmarkEnd w:id="44"/>
+    <w:bookmarkStart w:id="45" w:name="compliance-cards"/>
     <w:p>
       <w:pPr>
         <w:pStyle w:val="Heading3"/>
@@ -7886,8 +7999,8 @@
         <w:t xml:space="preserve">red background tint, the same treatment used for at-risk cards throughout this document.</w:t>
       </w:r>
     </w:p>
-    <w:bookmarkEnd w:id="44"/>
-    <w:bookmarkStart w:id="45" w:name="compliance-detail-screen"/>
+    <w:bookmarkEnd w:id="45"/>
+    <w:bookmarkStart w:id="46" w:name="compliance-detail-screen"/>
     <w:p>
       <w:pPr>
         <w:pStyle w:val="Heading3"/>
@@ -7964,8 +8077,8 @@
         <w:t xml:space="preserve">with a link back to the full list.</w:t>
       </w:r>
     </w:p>
-    <w:bookmarkEnd w:id="45"/>
-    <w:bookmarkStart w:id="46" w:name="page-header-and-about-block"/>
+    <w:bookmarkEnd w:id="46"/>
+    <w:bookmarkStart w:id="47" w:name="page-header-and-about-block"/>
     <w:p>
       <w:pPr>
         <w:pStyle w:val="Heading3"/>
@@ -8221,8 +8334,8 @@
         <w:t xml:space="preserve">, the plain-language description of what the late fee or penalty is.</w:t>
       </w:r>
     </w:p>
-    <w:bookmarkEnd w:id="46"/>
-    <w:bookmarkStart w:id="47" w:name="summary-stats-4-boxes"/>
+    <w:bookmarkEnd w:id="47"/>
+    <w:bookmarkStart w:id="48" w:name="summary-stats-4-boxes"/>
     <w:p>
       <w:pPr>
         <w:pStyle w:val="Heading3"/>
@@ -8399,8 +8512,8 @@
         <w:t xml:space="preserve">nothing from a closed year is still awaiting action.</w:t>
       </w:r>
     </w:p>
-    <w:bookmarkEnd w:id="47"/>
-    <w:bookmarkStart w:id="48" w:name="every-date-as-a-table"/>
+    <w:bookmarkEnd w:id="48"/>
+    <w:bookmarkStart w:id="49" w:name="every-date-as-a-table"/>
     <w:p>
       <w:pPr>
         <w:pStyle w:val="Heading3"/>
@@ -8711,9 +8824,9 @@
         </w:pict>
       </w:r>
     </w:p>
-    <w:bookmarkEnd w:id="48"/>
     <w:bookmarkEnd w:id="49"/>
-    <w:bookmarkStart w:id="59" w:name="module-4-tracker"/>
+    <w:bookmarkEnd w:id="50"/>
+    <w:bookmarkStart w:id="60" w:name="module-4-tracker"/>
     <w:p>
       <w:pPr>
         <w:pStyle w:val="Heading2"/>
@@ -8758,7 +8871,7 @@
         <w:t xml:space="preserve">tracker.”</w:t>
       </w:r>
     </w:p>
-    <w:bookmarkStart w:id="50" w:name="purpose-3"/>
+    <w:bookmarkStart w:id="51" w:name="purpose-3"/>
     <w:p>
       <w:pPr>
         <w:pStyle w:val="Heading3"/>
@@ -8805,8 +8918,8 @@
         <w:t xml:space="preserve">at once.</w:t>
       </w:r>
     </w:p>
-    <w:bookmarkEnd w:id="50"/>
-    <w:bookmarkStart w:id="51" w:name="layout-top-to-bottom-2"/>
+    <w:bookmarkEnd w:id="51"/>
+    <w:bookmarkStart w:id="52" w:name="layout-top-to-bottom-2"/>
     <w:p>
       <w:pPr>
         <w:pStyle w:val="Heading3"/>
@@ -8887,8 +9000,8 @@
         <w:t xml:space="preserve">A one-line note about what each part of the grid does</w:t>
       </w:r>
     </w:p>
-    <w:bookmarkEnd w:id="51"/>
-    <w:bookmarkStart w:id="52" w:name="page-header-3"/>
+    <w:bookmarkEnd w:id="52"/>
+    <w:bookmarkStart w:id="53" w:name="page-header-3"/>
     <w:p>
       <w:pPr>
         <w:pStyle w:val="Heading3"/>
@@ -9034,8 +9147,8 @@
         <w:t xml:space="preserve">button. See section 4.9.</w:t>
       </w:r>
     </w:p>
-    <w:bookmarkEnd w:id="52"/>
-    <w:bookmarkStart w:id="53" w:name="filter-bar"/>
+    <w:bookmarkEnd w:id="53"/>
+    <w:bookmarkStart w:id="54" w:name="filter-bar"/>
     <w:p>
       <w:pPr>
         <w:pStyle w:val="Heading3"/>
@@ -9806,8 +9919,8 @@
         <w:t xml:space="preserve">Widen the period or clear a filter.”</w:t>
       </w:r>
     </w:p>
-    <w:bookmarkEnd w:id="53"/>
-    <w:bookmarkStart w:id="54" w:name="column-grouping-and-headers"/>
+    <w:bookmarkEnd w:id="54"/>
+    <w:bookmarkStart w:id="55" w:name="column-grouping-and-headers"/>
     <w:p>
       <w:pPr>
         <w:pStyle w:val="Heading3"/>
@@ -10004,8 +10117,8 @@
         <w:t xml:space="preserve">while the rest of the grid scrolls underneath them, in either direction.</w:t>
       </w:r>
     </w:p>
-    <w:bookmarkEnd w:id="54"/>
-    <w:bookmarkStart w:id="55" w:name="the-grid-itself"/>
+    <w:bookmarkEnd w:id="55"/>
+    <w:bookmarkStart w:id="56" w:name="the-grid-itself"/>
     <w:p>
       <w:pPr>
         <w:pStyle w:val="Heading3"/>
@@ -10206,8 +10319,8 @@
         <w:t xml:space="preserve">status.</w:t>
       </w:r>
     </w:p>
-    <w:bookmarkEnd w:id="55"/>
-    <w:bookmarkStart w:id="56" w:name="legend-and-show-more"/>
+    <w:bookmarkEnd w:id="56"/>
+    <w:bookmarkStart w:id="57" w:name="legend-and-show-more"/>
     <w:p>
       <w:pPr>
         <w:pStyle w:val="Heading3"/>
@@ -10344,8 +10457,8 @@
         <w:t xml:space="preserve">the total estimated late fees across everything currently shown.</w:t>
       </w:r>
     </w:p>
-    <w:bookmarkEnd w:id="56"/>
-    <w:bookmarkStart w:id="57" w:name="full-screen-mode"/>
+    <w:bookmarkEnd w:id="57"/>
+    <w:bookmarkStart w:id="58" w:name="full-screen-mode"/>
     <w:p>
       <w:pPr>
         <w:pStyle w:val="Heading3"/>
@@ -10429,8 +10542,8 @@
         <w:t xml:space="preserve">rest of the page cannot scroll while full-screen is open.</w:t>
       </w:r>
     </w:p>
-    <w:bookmarkEnd w:id="57"/>
-    <w:bookmarkStart w:id="58" w:name="exporting-to-excel"/>
+    <w:bookmarkEnd w:id="58"/>
+    <w:bookmarkStart w:id="59" w:name="exporting-to-excel"/>
     <w:p>
       <w:pPr>
         <w:pStyle w:val="Heading3"/>
@@ -10512,9 +10625,9 @@
         </w:pict>
       </w:r>
     </w:p>
-    <w:bookmarkEnd w:id="58"/>
     <w:bookmarkEnd w:id="59"/>
-    <w:bookmarkStart w:id="75" w:name="module-5-clients"/>
+    <w:bookmarkEnd w:id="60"/>
+    <w:bookmarkStart w:id="76" w:name="module-5-clients"/>
     <w:p>
       <w:pPr>
         <w:pStyle w:val="Heading2"/>
@@ -10537,7 +10650,7 @@
         <w:t xml:space="preserve">opening one client from it.</w:t>
       </w:r>
     </w:p>
-    <w:bookmarkStart w:id="60" w:name="purpose-4"/>
+    <w:bookmarkStart w:id="61" w:name="purpose-4"/>
     <w:p>
       <w:pPr>
         <w:pStyle w:val="Heading3"/>
@@ -10586,8 +10699,8 @@
         <w:t xml:space="preserve">three to view.</w:t>
       </w:r>
     </w:p>
-    <w:bookmarkEnd w:id="60"/>
-    <w:bookmarkStart w:id="61" w:name="layout-top-to-bottom-list-screen-1"/>
+    <w:bookmarkEnd w:id="61"/>
+    <w:bookmarkStart w:id="62" w:name="layout-top-to-bottom-list-screen-1"/>
     <w:p>
       <w:pPr>
         <w:pStyle w:val="Heading3"/>
@@ -10650,8 +10763,8 @@
         <w:t xml:space="preserve">control</w:t>
       </w:r>
     </w:p>
-    <w:bookmarkEnd w:id="61"/>
-    <w:bookmarkStart w:id="62" w:name="page-header-4"/>
+    <w:bookmarkEnd w:id="62"/>
+    <w:bookmarkStart w:id="63" w:name="page-header-4"/>
     <w:p>
       <w:pPr>
         <w:pStyle w:val="Heading3"/>
@@ -10862,8 +10975,8 @@
         <w:t xml:space="preserve">button. See section 5.3.1.</w:t>
       </w:r>
     </w:p>
-    <w:bookmarkEnd w:id="62"/>
-    <w:bookmarkStart w:id="63" w:name="syncing-from-kdk"/>
+    <w:bookmarkEnd w:id="63"/>
+    <w:bookmarkStart w:id="64" w:name="syncing-from-kdk"/>
     <w:p>
       <w:pPr>
         <w:pStyle w:val="Heading3"/>
@@ -11072,8 +11185,8 @@
         <w:t xml:space="preserve">same as any profile edit already does (section 5.12).</w:t>
       </w:r>
     </w:p>
-    <w:bookmarkEnd w:id="63"/>
-    <w:bookmarkStart w:id="64" w:name="filters-row-2"/>
+    <w:bookmarkEnd w:id="64"/>
+    <w:bookmarkStart w:id="65" w:name="filters-row-2"/>
     <w:p>
       <w:pPr>
         <w:pStyle w:val="Heading3"/>
@@ -11415,8 +11528,8 @@
         <w:t xml:space="preserve">.</w:t>
       </w:r>
     </w:p>
-    <w:bookmarkEnd w:id="64"/>
-    <w:bookmarkStart w:id="65" w:name="the-client-table"/>
+    <w:bookmarkEnd w:id="65"/>
+    <w:bookmarkStart w:id="66" w:name="the-client-table"/>
     <w:p>
       <w:pPr>
         <w:pStyle w:val="Heading3"/>
@@ -11641,8 +11754,8 @@
         <w:t xml:space="preserve">: right-aligned, the estimated late fee in bold red, or a dash if there is none.</w:t>
       </w:r>
     </w:p>
-    <w:bookmarkEnd w:id="65"/>
-    <w:bookmarkStart w:id="66" w:name="loading-more-clients"/>
+    <w:bookmarkEnd w:id="66"/>
+    <w:bookmarkStart w:id="67" w:name="loading-more-clients"/>
     <w:p>
       <w:pPr>
         <w:pStyle w:val="Heading3"/>
@@ -11721,8 +11834,8 @@
         <w:t xml:space="preserve">these filters.”</w:t>
       </w:r>
     </w:p>
-    <w:bookmarkEnd w:id="66"/>
-    <w:bookmarkStart w:id="67" w:name="client-detail-screen"/>
+    <w:bookmarkEnd w:id="67"/>
+    <w:bookmarkStart w:id="68" w:name="client-detail-screen"/>
     <w:p>
       <w:pPr>
         <w:pStyle w:val="Heading3"/>
@@ -11827,8 +11940,8 @@
         <w:t xml:space="preserve">single year.</w:t>
       </w:r>
     </w:p>
-    <w:bookmarkEnd w:id="67"/>
-    <w:bookmarkStart w:id="68" w:name="identity-block"/>
+    <w:bookmarkEnd w:id="68"/>
+    <w:bookmarkStart w:id="69" w:name="identity-block"/>
     <w:p>
       <w:pPr>
         <w:pStyle w:val="Heading3"/>
@@ -12103,8 +12216,8 @@
         <w:t xml:space="preserve">it will do next, worded differently depending on the current state.</w:t>
       </w:r>
     </w:p>
-    <w:bookmarkEnd w:id="68"/>
-    <w:bookmarkStart w:id="69" w:name="summary-stats-4-boxes-1"/>
+    <w:bookmarkEnd w:id="69"/>
+    <w:bookmarkStart w:id="70" w:name="summary-stats-4-boxes-1"/>
     <w:p>
       <w:pPr>
         <w:pStyle w:val="Heading3"/>
@@ -12292,8 +12405,8 @@
         <w:t xml:space="preserve">.</w:t>
       </w:r>
     </w:p>
-    <w:bookmarkEnd w:id="69"/>
-    <w:bookmarkStart w:id="70" w:name="the-three-tabs"/>
+    <w:bookmarkEnd w:id="70"/>
+    <w:bookmarkStart w:id="71" w:name="the-three-tabs"/>
     <w:p>
       <w:pPr>
         <w:pStyle w:val="Heading3"/>
@@ -12408,8 +12521,8 @@
         <w:t xml:space="preserve">tabs.</w:t>
       </w:r>
     </w:p>
-    <w:bookmarkEnd w:id="70"/>
-    <w:bookmarkStart w:id="71" w:name="obligations-tab"/>
+    <w:bookmarkEnd w:id="71"/>
+    <w:bookmarkStart w:id="72" w:name="obligations-tab"/>
     <w:p>
       <w:pPr>
         <w:pStyle w:val="Heading3"/>
@@ -12626,8 +12739,8 @@
         <w:t xml:space="preserve">did, the date it was filed (or its due date if not filed), and a status tag.</w:t>
       </w:r>
     </w:p>
-    <w:bookmarkEnd w:id="71"/>
-    <w:bookmarkStart w:id="72" w:name="compliance-profile-tab"/>
+    <w:bookmarkEnd w:id="72"/>
+    <w:bookmarkStart w:id="73" w:name="compliance-profile-tab"/>
     <w:p>
       <w:pPr>
         <w:pStyle w:val="Heading3"/>
@@ -12744,8 +12857,8 @@
         <w:t xml:space="preserve">and scheduled reminders are rebuilt to match.</w:t>
       </w:r>
     </w:p>
-    <w:bookmarkEnd w:id="72"/>
-    <w:bookmarkStart w:id="73" w:name="communications-tab"/>
+    <w:bookmarkEnd w:id="73"/>
+    <w:bookmarkStart w:id="74" w:name="communications-tab"/>
     <w:p>
       <w:pPr>
         <w:pStyle w:val="Heading3"/>
@@ -12885,8 +12998,8 @@
         <w:t xml:space="preserve">Nothing has met a trigger for this client.”</w:t>
       </w:r>
     </w:p>
-    <w:bookmarkEnd w:id="73"/>
-    <w:bookmarkStart w:id="74" w:name="footer-note-1"/>
+    <w:bookmarkEnd w:id="74"/>
+    <w:bookmarkStart w:id="75" w:name="footer-note-1"/>
     <w:p>
       <w:pPr>
         <w:pStyle w:val="Heading3"/>
@@ -12948,9 +13061,9 @@
         </w:pict>
       </w:r>
     </w:p>
-    <w:bookmarkEnd w:id="74"/>
     <w:bookmarkEnd w:id="75"/>
-    <w:bookmarkStart w:id="90" w:name="module-6-reminders"/>
+    <w:bookmarkEnd w:id="76"/>
+    <w:bookmarkStart w:id="91" w:name="module-6-reminders"/>
     <w:p>
       <w:pPr>
         <w:pStyle w:val="Heading2"/>
@@ -12993,7 +13106,7 @@
         <w:t xml:space="preserve">[link to be added]</w:t>
       </w:r>
     </w:p>
-    <w:bookmarkStart w:id="76" w:name="purpose-5"/>
+    <w:bookmarkStart w:id="77" w:name="purpose-5"/>
     <w:p>
       <w:pPr>
         <w:pStyle w:val="Heading3"/>
@@ -13054,8 +13167,8 @@
         <w:t xml:space="preserve">here; that lives in Settings, covered in its own module later in this document.</w:t>
       </w:r>
     </w:p>
-    <w:bookmarkEnd w:id="76"/>
-    <w:bookmarkStart w:id="77" w:name="what-stops-a-reminder"/>
+    <w:bookmarkEnd w:id="77"/>
+    <w:bookmarkStart w:id="78" w:name="what-stops-a-reminder"/>
     <w:p>
       <w:pPr>
         <w:pStyle w:val="Heading3"/>
@@ -13286,8 +13399,8 @@
         <w:t xml:space="preserve">Email; only the WhatsApp leg is skipped (section 5.8).</w:t>
       </w:r>
     </w:p>
-    <w:bookmarkEnd w:id="77"/>
-    <w:bookmarkStart w:id="78" w:name="layout-top-to-bottom-3"/>
+    <w:bookmarkEnd w:id="78"/>
+    <w:bookmarkStart w:id="79" w:name="layout-top-to-bottom-3"/>
     <w:p>
       <w:pPr>
         <w:pStyle w:val="Heading3"/>
@@ -13332,8 +13445,8 @@
         <w:t xml:space="preserve">Whichever tab is open</w:t>
       </w:r>
     </w:p>
-    <w:bookmarkEnd w:id="78"/>
-    <w:bookmarkStart w:id="79" w:name="page-header-5"/>
+    <w:bookmarkEnd w:id="79"/>
+    <w:bookmarkStart w:id="80" w:name="page-header-5"/>
     <w:p>
       <w:pPr>
         <w:pStyle w:val="Heading3"/>
@@ -13471,8 +13584,8 @@
         <w:t xml:space="preserve">document).</w:t>
       </w:r>
     </w:p>
-    <w:bookmarkEnd w:id="79"/>
-    <w:bookmarkStart w:id="80" w:name="the-two-tabs"/>
+    <w:bookmarkEnd w:id="80"/>
+    <w:bookmarkStart w:id="81" w:name="the-two-tabs"/>
     <w:p>
       <w:pPr>
         <w:pStyle w:val="Heading3"/>
@@ -13524,8 +13637,8 @@
         <w:t xml:space="preserve">Clicking either one switches the content below it.</w:t>
       </w:r>
     </w:p>
-    <w:bookmarkEnd w:id="80"/>
-    <w:bookmarkStart w:id="81" w:name="log-tab-summary-stats-5-boxes"/>
+    <w:bookmarkEnd w:id="81"/>
+    <w:bookmarkStart w:id="82" w:name="log-tab-summary-stats-5-boxes"/>
     <w:p>
       <w:pPr>
         <w:pStyle w:val="Heading3"/>
@@ -13706,8 +13819,8 @@
         <w:t xml:space="preserve">; clicking it filters the table below to exactly these.</w:t>
       </w:r>
     </w:p>
-    <w:bookmarkEnd w:id="81"/>
-    <w:bookmarkStart w:id="82" w:name="log-tab-filters"/>
+    <w:bookmarkEnd w:id="82"/>
+    <w:bookmarkStart w:id="83" w:name="log-tab-filters"/>
     <w:p>
       <w:pPr>
         <w:pStyle w:val="Heading3"/>
@@ -14376,8 +14489,8 @@
         <w:t xml:space="preserve">“Nothing matches: try clearing a filter or widening the date range.”</w:t>
       </w:r>
     </w:p>
-    <w:bookmarkEnd w:id="82"/>
-    <w:bookmarkStart w:id="83" w:name="log-tab-selecting-rows-and-bulk-actions"/>
+    <w:bookmarkEnd w:id="83"/>
+    <w:bookmarkStart w:id="84" w:name="log-tab-selecting-rows-and-bulk-actions"/>
     <w:p>
       <w:pPr>
         <w:pStyle w:val="Heading3"/>
@@ -14833,8 +14946,8 @@
         <w:t xml:space="preserve">attempts.”</w:t>
       </w:r>
     </w:p>
-    <w:bookmarkEnd w:id="83"/>
-    <w:bookmarkStart w:id="84" w:name="log-tab-the-table"/>
+    <w:bookmarkEnd w:id="84"/>
+    <w:bookmarkStart w:id="85" w:name="log-tab-the-table"/>
     <w:p>
       <w:pPr>
         <w:pStyle w:val="Heading3"/>
@@ -15066,7 +15179,13 @@
         <w:t xml:space="preserve"> </w:t>
       </w:r>
       <w:r>
-        <w:t xml:space="preserve">red.</w:t>
+        <w:t xml:space="preserve">red. This status is fetched from the sending provider, not tracked independently: Zepto Mail</w:t>
+      </w:r>
+      <w:r>
+        <w:t xml:space="preserve"> </w:t>
+      </w:r>
+      <w:r>
+        <w:t xml:space="preserve">for email, Rampwin for WhatsApp.</w:t>
       </w:r>
     </w:p>
     <w:p>
@@ -15204,8 +15323,8 @@
         <w:t xml:space="preserve">.”</w:t>
       </w:r>
     </w:p>
-    <w:bookmarkEnd w:id="84"/>
-    <w:bookmarkStart w:id="85" w:name="log-tab-exporting-to-excel"/>
+    <w:bookmarkEnd w:id="85"/>
+    <w:bookmarkStart w:id="86" w:name="log-tab-exporting-to-excel"/>
     <w:p>
       <w:pPr>
         <w:pStyle w:val="Heading3"/>
@@ -15290,8 +15409,8 @@
         <w:t xml:space="preserve">. A message confirms how many were exported.</w:t>
       </w:r>
     </w:p>
-    <w:bookmarkEnd w:id="85"/>
-    <w:bookmarkStart w:id="86" w:name="scheduled-tab-summary-stats-4-boxes"/>
+    <w:bookmarkEnd w:id="86"/>
+    <w:bookmarkStart w:id="87" w:name="scheduled-tab-summary-stats-4-boxes"/>
     <w:p>
       <w:pPr>
         <w:pStyle w:val="Heading3"/>
@@ -15489,8 +15608,8 @@
         <w:t xml:space="preserve">straight there.</w:t>
       </w:r>
     </w:p>
-    <w:bookmarkEnd w:id="86"/>
-    <w:bookmarkStart w:id="87" w:name="scheduled-tab-filters-and-manual-send"/>
+    <w:bookmarkEnd w:id="87"/>
+    <w:bookmarkStart w:id="88" w:name="scheduled-tab-filters-and-manual-send"/>
     <w:p>
       <w:pPr>
         <w:pStyle w:val="Heading3"/>
@@ -15629,8 +15748,8 @@
         <w:t xml:space="preserve">“No reminders are due.”</w:t>
       </w:r>
     </w:p>
-    <w:bookmarkEnd w:id="87"/>
-    <w:bookmarkStart w:id="88" w:name="scheduled-tab-the-table"/>
+    <w:bookmarkEnd w:id="88"/>
+    <w:bookmarkStart w:id="89" w:name="scheduled-tab-the-table"/>
     <w:p>
       <w:pPr>
         <w:pStyle w:val="Heading3"/>
@@ -16086,8 +16205,8 @@
         <w:t xml:space="preserve">sent are excluded from it.”</w:t>
       </w:r>
     </w:p>
-    <w:bookmarkEnd w:id="88"/>
-    <w:bookmarkStart w:id="89" w:name="deep-links-from-elsewhere-in-the-product"/>
+    <w:bookmarkEnd w:id="89"/>
+    <w:bookmarkStart w:id="90" w:name="deep-links-from-elsewhere-in-the-product"/>
     <w:p>
       <w:pPr>
         <w:pStyle w:val="Heading3"/>
@@ -16141,9 +16260,9 @@
         </w:pict>
       </w:r>
     </w:p>
-    <w:bookmarkEnd w:id="89"/>
     <w:bookmarkEnd w:id="90"/>
-    <w:bookmarkStart w:id="100" w:name="module-7-settings"/>
+    <w:bookmarkEnd w:id="91"/>
+    <w:bookmarkStart w:id="101" w:name="module-7-settings"/>
     <w:p>
       <w:pPr>
         <w:pStyle w:val="Heading2"/>
@@ -16152,7 +16271,7 @@
         <w:t xml:space="preserve">Module 7: Settings</w:t>
       </w:r>
     </w:p>
-    <w:bookmarkStart w:id="91" w:name="purpose-6"/>
+    <w:bookmarkStart w:id="92" w:name="purpose-6"/>
     <w:p>
       <w:pPr>
         <w:pStyle w:val="Heading3"/>
@@ -16187,8 +16306,8 @@
         <w:t xml:space="preserve">on this screen writes immediately; there is no separate Save step anywhere in Settings.</w:t>
       </w:r>
     </w:p>
-    <w:bookmarkEnd w:id="91"/>
-    <w:bookmarkStart w:id="92" w:name="layout"/>
+    <w:bookmarkEnd w:id="92"/>
+    <w:bookmarkStart w:id="93" w:name="layout"/>
     <w:p>
       <w:pPr>
         <w:pStyle w:val="Heading3"/>
@@ -16221,8 +16340,8 @@
         <w:t xml:space="preserve">is open by default.</w:t>
       </w:r>
     </w:p>
-    <w:bookmarkEnd w:id="92"/>
-    <w:bookmarkStart w:id="93" w:name="section-menu"/>
+    <w:bookmarkEnd w:id="93"/>
+    <w:bookmarkStart w:id="94" w:name="section-menu"/>
     <w:p>
       <w:pPr>
         <w:pStyle w:val="Heading3"/>
@@ -16419,8 +16538,8 @@
         <w:t xml:space="preserve">“In-app alerts”</w:t>
       </w:r>
     </w:p>
-    <w:bookmarkEnd w:id="93"/>
-    <w:bookmarkStart w:id="94" w:name="firm"/>
+    <w:bookmarkEnd w:id="94"/>
+    <w:bookmarkStart w:id="95" w:name="firm"/>
     <w:p>
       <w:pPr>
         <w:pStyle w:val="Heading3"/>
@@ -16521,8 +16640,8 @@
         <w:t xml:space="preserve">Indian states), PIN code, Phone, Email, Website.</w:t>
       </w:r>
     </w:p>
-    <w:bookmarkEnd w:id="94"/>
-    <w:bookmarkStart w:id="95" w:name="sender"/>
+    <w:bookmarkEnd w:id="95"/>
+    <w:bookmarkStart w:id="96" w:name="sender"/>
     <w:p>
       <w:pPr>
         <w:pStyle w:val="Heading3"/>
@@ -16920,8 +17039,8 @@
         <w:t xml:space="preserve">right.</w:t>
       </w:r>
     </w:p>
-    <w:bookmarkEnd w:id="95"/>
-    <w:bookmarkStart w:id="96" w:name="reminders"/>
+    <w:bookmarkEnd w:id="96"/>
+    <w:bookmarkStart w:id="97" w:name="reminders"/>
     <w:p>
       <w:pPr>
         <w:pStyle w:val="Heading3"/>
@@ -17525,8 +17644,8 @@
         <w:t xml:space="preserve">working day: Friday if the deadline has not passed, Monday if it has.”</w:t>
       </w:r>
     </w:p>
-    <w:bookmarkEnd w:id="96"/>
-    <w:bookmarkStart w:id="97" w:name="compliances"/>
+    <w:bookmarkEnd w:id="97"/>
+    <w:bookmarkStart w:id="98" w:name="compliances"/>
     <w:p>
       <w:pPr>
         <w:pStyle w:val="Heading3"/>
@@ -17822,8 +17941,8 @@
         <w:t xml:space="preserve">“Nothing under this head.”</w:t>
       </w:r>
     </w:p>
-    <w:bookmarkEnd w:id="97"/>
-    <w:bookmarkStart w:id="98" w:name="team"/>
+    <w:bookmarkEnd w:id="98"/>
+    <w:bookmarkStart w:id="99" w:name="team"/>
     <w:p>
       <w:pPr>
         <w:pStyle w:val="Heading3"/>
@@ -18000,8 +18119,8 @@
         <w:t xml:space="preserve">Team.</w:t>
       </w:r>
     </w:p>
-    <w:bookmarkEnd w:id="98"/>
-    <w:bookmarkStart w:id="99" w:name="alerts"/>
+    <w:bookmarkEnd w:id="99"/>
+    <w:bookmarkStart w:id="100" w:name="alerts"/>
     <w:p>
       <w:pPr>
         <w:pStyle w:val="Heading3"/>
@@ -18204,9 +18323,9 @@
         </w:pict>
       </w:r>
     </w:p>
-    <w:bookmarkEnd w:id="99"/>
     <w:bookmarkEnd w:id="100"/>
-    <w:bookmarkStart w:id="110" w:name="module-8-filing-run-detail"/>
+    <w:bookmarkEnd w:id="101"/>
+    <w:bookmarkStart w:id="111" w:name="module-8-filing-run-detail"/>
     <w:p>
       <w:pPr>
         <w:pStyle w:val="Heading2"/>
@@ -18229,7 +18348,7 @@
         <w:t xml:space="preserve">anywhere else in this document (Calendar, Compliances, Tracker, Dashboard’s queue).</w:t>
       </w:r>
     </w:p>
-    <w:bookmarkStart w:id="101" w:name="purpose-7"/>
+    <w:bookmarkStart w:id="102" w:name="purpose-7"/>
     <w:p>
       <w:pPr>
         <w:pStyle w:val="Heading3"/>
@@ -18285,8 +18404,8 @@
         <w:t xml:space="preserve">.</w:t>
       </w:r>
     </w:p>
-    <w:bookmarkEnd w:id="101"/>
-    <w:bookmarkStart w:id="102" w:name="layout-top-to-bottom-4"/>
+    <w:bookmarkEnd w:id="102"/>
+    <w:bookmarkStart w:id="103" w:name="layout-top-to-bottom-4"/>
     <w:p>
       <w:pPr>
         <w:pStyle w:val="Heading3"/>
@@ -18355,8 +18474,8 @@
         <w:t xml:space="preserve">The client table, with bulk actions when rows are selected</w:t>
       </w:r>
     </w:p>
-    <w:bookmarkEnd w:id="102"/>
-    <w:bookmarkStart w:id="103" w:name="page-header-6"/>
+    <w:bookmarkEnd w:id="103"/>
+    <w:bookmarkStart w:id="104" w:name="page-header-6"/>
     <w:p>
       <w:pPr>
         <w:pStyle w:val="Heading3"/>
@@ -18554,8 +18673,8 @@
         <w:t xml:space="preserve">clients attached, or the link is stale.”</w:t>
       </w:r>
     </w:p>
-    <w:bookmarkEnd w:id="103"/>
-    <w:bookmarkStart w:id="104" w:name="Xeb5bde1bc6a3013e3f4e1e1608222212e18c9ca"/>
+    <w:bookmarkEnd w:id="104"/>
+    <w:bookmarkStart w:id="105" w:name="Xeb5bde1bc6a3013e3f4e1e1608222212e18c9ca"/>
     <w:p>
       <w:pPr>
         <w:pStyle w:val="Heading3"/>
@@ -18743,8 +18862,8 @@
         <w:t xml:space="preserve">.”</w:t>
       </w:r>
     </w:p>
-    <w:bookmarkEnd w:id="104"/>
-    <w:bookmarkStart w:id="105" w:name="filters-row-3"/>
+    <w:bookmarkEnd w:id="105"/>
+    <w:bookmarkStart w:id="106" w:name="filters-row-3"/>
     <w:p>
       <w:pPr>
         <w:pStyle w:val="Heading3"/>
@@ -18952,8 +19071,8 @@
         <w:t xml:space="preserve">On the right: a running row count.</w:t>
       </w:r>
     </w:p>
-    <w:bookmarkEnd w:id="105"/>
-    <w:bookmarkStart w:id="106" w:name="the-client-table-1"/>
+    <w:bookmarkEnd w:id="106"/>
+    <w:bookmarkStart w:id="107" w:name="the-client-table-1"/>
     <w:p>
       <w:pPr>
         <w:pStyle w:val="Heading3"/>
@@ -19223,8 +19342,8 @@
         <w:t xml:space="preserve">“No clients match these filters.”</w:t>
       </w:r>
     </w:p>
-    <w:bookmarkEnd w:id="106"/>
-    <w:bookmarkStart w:id="107" w:name="selecting-rows-and-bulk-actions"/>
+    <w:bookmarkEnd w:id="107"/>
+    <w:bookmarkStart w:id="108" w:name="selecting-rows-and-bulk-actions"/>
     <w:p>
       <w:pPr>
         <w:pStyle w:val="Heading3"/>
@@ -19601,8 +19720,8 @@
         <w:t xml:space="preserve">the late fee outright.</w:t>
       </w:r>
     </w:p>
-    <w:bookmarkEnd w:id="107"/>
-    <w:bookmarkStart w:id="108" w:name="exporting-to-excel-1"/>
+    <w:bookmarkEnd w:id="108"/>
+    <w:bookmarkStart w:id="109" w:name="exporting-to-excel-1"/>
     <w:p>
       <w:pPr>
         <w:pStyle w:val="Heading3"/>
@@ -19677,8 +19796,8 @@
         <w:t xml:space="preserve">how many rows were exported.</w:t>
       </w:r>
     </w:p>
-    <w:bookmarkEnd w:id="108"/>
-    <w:bookmarkStart w:id="109" w:name="footer-note-2"/>
+    <w:bookmarkEnd w:id="109"/>
+    <w:bookmarkStart w:id="110" w:name="footer-note-2"/>
     <w:p>
       <w:pPr>
         <w:pStyle w:val="Heading3"/>
@@ -19770,9 +19889,9 @@
         </w:pict>
       </w:r>
     </w:p>
-    <w:bookmarkEnd w:id="109"/>
     <w:bookmarkEnd w:id="110"/>
-    <w:bookmarkStart w:id="117" w:name="module-9-obligation-detail-panel"/>
+    <w:bookmarkEnd w:id="111"/>
+    <w:bookmarkStart w:id="118" w:name="module-9-obligation-detail-panel"/>
     <w:p>
       <w:pPr>
         <w:pStyle w:val="Heading2"/>
@@ -19813,7 +19932,7 @@
         <w:t xml:space="preserve">is what it is, and lets staff act on it without leaving the screen behind it.</w:t>
       </w:r>
     </w:p>
-    <w:bookmarkStart w:id="111" w:name="purpose-8"/>
+    <w:bookmarkStart w:id="112" w:name="purpose-8"/>
     <w:p>
       <w:pPr>
         <w:pStyle w:val="Heading3"/>
@@ -19854,8 +19973,8 @@
         <w:t xml:space="preserve">overrode it, and precisely how any penalty figure was worked out.</w:t>
       </w:r>
     </w:p>
-    <w:bookmarkEnd w:id="111"/>
-    <w:bookmarkStart w:id="112" w:name="opening-and-closing"/>
+    <w:bookmarkEnd w:id="112"/>
+    <w:bookmarkStart w:id="113" w:name="opening-and-closing"/>
     <w:p>
       <w:pPr>
         <w:pStyle w:val="Heading3"/>
@@ -20000,8 +20119,8 @@
         <w:t xml:space="preserve">goes to that client’s own page and closes the drawer.</w:t>
       </w:r>
     </w:p>
-    <w:bookmarkEnd w:id="112"/>
-    <w:bookmarkStart w:id="113" w:name="whats-shown-all-at-once"/>
+    <w:bookmarkEnd w:id="113"/>
+    <w:bookmarkStart w:id="114" w:name="whats-shown-all-at-once"/>
     <w:p>
       <w:pPr>
         <w:pStyle w:val="Heading3"/>
@@ -20451,8 +20570,8 @@
         <w:t xml:space="preserve">drawer.</w:t>
       </w:r>
     </w:p>
-    <w:bookmarkEnd w:id="113"/>
-    <w:bookmarkStart w:id="114" w:name="footer-actions"/>
+    <w:bookmarkEnd w:id="114"/>
+    <w:bookmarkStart w:id="115" w:name="footer-actions"/>
     <w:p>
       <w:pPr>
         <w:pStyle w:val="Heading3"/>
@@ -20712,8 +20831,8 @@
         <w:t xml:space="preserve">(otherwise): opens the override panel described in section 9.6.</w:t>
       </w:r>
     </w:p>
-    <w:bookmarkEnd w:id="114"/>
-    <w:bookmarkStart w:id="115" w:name="record-this-filing-panel"/>
+    <w:bookmarkEnd w:id="115"/>
+    <w:bookmarkStart w:id="116" w:name="record-this-filing-panel"/>
     <w:p>
       <w:pPr>
         <w:pStyle w:val="Heading3"/>
@@ -20891,8 +21010,8 @@
         <w:t xml:space="preserve">action attached to that same message; clicking Undo reopens the obligation again.</w:t>
       </w:r>
     </w:p>
-    <w:bookmarkEnd w:id="115"/>
-    <w:bookmarkStart w:id="116" w:name="X574bf854e536ed97e28c999042237ae14ffd522"/>
+    <w:bookmarkEnd w:id="116"/>
+    <w:bookmarkStart w:id="117" w:name="X574bf854e536ed97e28c999042237ae14ffd522"/>
     <w:p>
       <w:pPr>
         <w:pStyle w:val="Heading3"/>
@@ -21109,9 +21228,9 @@
         </w:pict>
       </w:r>
     </w:p>
-    <w:bookmarkEnd w:id="116"/>
     <w:bookmarkEnd w:id="117"/>
-    <w:bookmarkStart w:id="123" w:name="module-10-message-preview"/>
+    <w:bookmarkEnd w:id="118"/>
+    <w:bookmarkStart w:id="124" w:name="module-10-message-preview"/>
     <w:p>
       <w:pPr>
         <w:pStyle w:val="Heading2"/>
@@ -21158,7 +21277,7 @@
         <w:t xml:space="preserve">exists to answer, and a truncated line of text in a table cannot answer it.</w:t>
       </w:r>
     </w:p>
-    <w:bookmarkStart w:id="118" w:name="opening-and-closing-1"/>
+    <w:bookmarkStart w:id="119" w:name="opening-and-closing-1"/>
     <w:p>
       <w:pPr>
         <w:pStyle w:val="Heading3"/>
@@ -21319,8 +21438,8 @@
         <w:t xml:space="preserve">.</w:t>
       </w:r>
     </w:p>
-    <w:bookmarkEnd w:id="118"/>
-    <w:bookmarkStart w:id="119" w:name="footer"/>
+    <w:bookmarkEnd w:id="119"/>
+    <w:bookmarkStart w:id="120" w:name="footer"/>
     <w:p>
       <w:pPr>
         <w:pStyle w:val="Heading3"/>
@@ -21488,8 +21607,8 @@
         <w:t xml:space="preserve">On the right, a status tag showing this message’s current delivery state.</w:t>
       </w:r>
     </w:p>
-    <w:bookmarkEnd w:id="119"/>
-    <w:bookmarkStart w:id="120" w:name="whatsapp-rendering"/>
+    <w:bookmarkEnd w:id="120"/>
+    <w:bookmarkStart w:id="121" w:name="whatsapp-rendering"/>
     <w:p>
       <w:pPr>
         <w:pStyle w:val="Heading3"/>
@@ -21791,8 +21910,8 @@
         <w:t xml:space="preserve">its icons can be clicked.</w:t>
       </w:r>
     </w:p>
-    <w:bookmarkEnd w:id="120"/>
-    <w:bookmarkStart w:id="121" w:name="email-rendering"/>
+    <w:bookmarkEnd w:id="121"/>
+    <w:bookmarkStart w:id="122" w:name="email-rendering"/>
     <w:p>
       <w:pPr>
         <w:pStyle w:val="Heading3"/>
@@ -21910,8 +22029,8 @@
         <w:t xml:space="preserve">The message body, exactly as sent.</w:t>
       </w:r>
     </w:p>
-    <w:bookmarkEnd w:id="121"/>
-    <w:bookmarkStart w:id="122" w:name="X0b7b5ead0d7f9e3685e3f3092935b1a8101288f"/>
+    <w:bookmarkEnd w:id="122"/>
+    <w:bookmarkStart w:id="123" w:name="X0b7b5ead0d7f9e3685e3f3092935b1a8101288f"/>
     <w:p>
       <w:pPr>
         <w:pStyle w:val="Heading3"/>
@@ -22055,9 +22174,9 @@
         </w:pict>
       </w:r>
     </w:p>
-    <w:bookmarkEnd w:id="122"/>
     <w:bookmarkEnd w:id="123"/>
-    <w:bookmarkStart w:id="130" w:name="module-11-shared-chrome"/>
+    <w:bookmarkEnd w:id="124"/>
+    <w:bookmarkStart w:id="131" w:name="module-11-shared-chrome"/>
     <w:p>
       <w:pPr>
         <w:pStyle w:val="Heading2"/>
@@ -22080,7 +22199,7 @@
         <w:t xml:space="preserve">covered by every other module in this document.</w:t>
       </w:r>
     </w:p>
-    <w:bookmarkStart w:id="124" w:name="purpose-9"/>
+    <w:bookmarkStart w:id="125" w:name="purpose-9"/>
     <w:p>
       <w:pPr>
         <w:pStyle w:val="Heading3"/>
@@ -22103,8 +22222,8 @@
         <w:t xml:space="preserve">to search or jump anywhere, what needs attention right now, and who’s signed in.</w:t>
       </w:r>
     </w:p>
-    <w:bookmarkEnd w:id="124"/>
-    <w:bookmarkStart w:id="125" w:name="the-left-rail"/>
+    <w:bookmarkEnd w:id="125"/>
+    <w:bookmarkStart w:id="126" w:name="the-left-rail"/>
     <w:p>
       <w:pPr>
         <w:pStyle w:val="Heading3"/>
@@ -22466,8 +22585,8 @@
         <w:t xml:space="preserve">button described above.</w:t>
       </w:r>
     </w:p>
-    <w:bookmarkEnd w:id="125"/>
-    <w:bookmarkStart w:id="126" w:name="the-top-bar"/>
+    <w:bookmarkEnd w:id="126"/>
+    <w:bookmarkStart w:id="127" w:name="the-top-bar"/>
     <w:p>
       <w:pPr>
         <w:pStyle w:val="Heading3"/>
@@ -22878,8 +22997,8 @@
         <w:t xml:space="preserve">, styled as a warning action: signs the user out of their account entirely.</w:t>
       </w:r>
     </w:p>
-    <w:bookmarkEnd w:id="126"/>
-    <w:bookmarkStart w:id="127" w:name="notification-bell"/>
+    <w:bookmarkEnd w:id="127"/>
+    <w:bookmarkStart w:id="128" w:name="notification-bell"/>
     <w:p>
       <w:pPr>
         <w:pStyle w:val="Heading3"/>
@@ -23090,8 +23209,8 @@
         <w:t xml:space="preserve">and closes the popover.</w:t>
       </w:r>
     </w:p>
-    <w:bookmarkEnd w:id="127"/>
-    <w:bookmarkStart w:id="128" w:name="command-palette"/>
+    <w:bookmarkEnd w:id="128"/>
+    <w:bookmarkStart w:id="129" w:name="command-palette"/>
     <w:p>
       <w:pPr>
         <w:pStyle w:val="Heading3"/>
@@ -23354,8 +23473,8 @@
         <w:t xml:space="preserve">”.”</w:t>
       </w:r>
     </w:p>
-    <w:bookmarkEnd w:id="128"/>
-    <w:bookmarkStart w:id="129" w:name="boot-splash"/>
+    <w:bookmarkEnd w:id="129"/>
+    <w:bookmarkStart w:id="130" w:name="boot-splash"/>
     <w:p>
       <w:pPr>
         <w:pStyle w:val="Heading3"/>
@@ -23419,9 +23538,9 @@
         <w:t xml:space="preserve">(End of Module 11. This completes the first full pass over every screen in the product.)</w:t>
       </w:r>
     </w:p>
-    <w:bookmarkEnd w:id="129"/>
     <w:bookmarkEnd w:id="130"/>
     <w:bookmarkEnd w:id="131"/>
+    <w:bookmarkEnd w:id="132"/>
     <w:sectPr>
       <w:footnotePr>
         <w:numRestart w:val="eachSect"/>

</xml_diff>